<commit_message>
2.16 release programmation completed
- auto-detection of Cz reref by ICA and Interpolation module
- update manuals
- Update README.md
</commit_message>
<xml_diff>
--- a/Manuels/Manuel_BATCHparameters_tool.docx
+++ b/Manuels/Manuel_BATCHparameters_tool.docx
@@ -67,14 +67,7 @@
           <w:rFonts w:ascii="Calibri" w:hAnsi="Calibri" w:cs="Calibri"/>
           <w:lang w:val="en-US"/>
         </w:rPr>
-        <w:t>0</w:t>
-      </w:r>
-      <w:r>
-        <w:rPr>
-          <w:rFonts w:ascii="Calibri" w:hAnsi="Calibri" w:cs="Calibri"/>
-          <w:lang w:val="en-US"/>
-        </w:rPr>
-        <w:t>1</w:t>
+        <w:t>16</w:t>
       </w:r>
       <w:r>
         <w:rPr>
@@ -88,14 +81,7 @@
           <w:rFonts w:ascii="Calibri" w:hAnsi="Calibri" w:cs="Calibri"/>
           <w:lang w:val="en-US"/>
         </w:rPr>
-        <w:t>2</w:t>
-      </w:r>
-      <w:r>
-        <w:rPr>
-          <w:rFonts w:ascii="Calibri" w:hAnsi="Calibri" w:cs="Calibri"/>
-          <w:lang w:val="en-US"/>
-        </w:rPr>
-        <w:t>0</w:t>
+        <w:t>19</w:t>
       </w:r>
       <w:r>
         <w:rPr>
@@ -109,7 +95,7 @@
           <w:rFonts w:ascii="Calibri" w:hAnsi="Calibri" w:cs="Calibri"/>
           <w:lang w:val="en-US"/>
         </w:rPr>
-        <w:t>11</w:t>
+        <w:t>09</w:t>
       </w:r>
       <w:r>
         <w:rPr>
@@ -123,7 +109,7 @@
           <w:rFonts w:ascii="Calibri" w:hAnsi="Calibri" w:cs="Calibri"/>
           <w:lang w:val="en-US"/>
         </w:rPr>
-        <w:t>5</w:t>
+        <w:t>6</w:t>
       </w:r>
     </w:p>
     <w:p>
@@ -418,23 +404,7 @@
           <w:rFonts w:ascii="Calibri" w:hAnsi="Calibri" w:cs="Calibri"/>
           <w:lang w:val="en-US"/>
         </w:rPr>
-        <w:t xml:space="preserve">In the top left corner, you will see a list of all the available processing steps for the batch (depending on step 1). Note: </w:t>
-      </w:r>
-      <w:proofErr w:type="gramStart"/>
-      <w:r>
-        <w:rPr>
-          <w:rFonts w:ascii="Calibri" w:hAnsi="Calibri" w:cs="Calibri"/>
-          <w:lang w:val="en-US"/>
-        </w:rPr>
-        <w:t>the</w:t>
-      </w:r>
-      <w:proofErr w:type="gramEnd"/>
-      <w:r>
-        <w:rPr>
-          <w:rFonts w:ascii="Calibri" w:hAnsi="Calibri" w:cs="Calibri"/>
-          <w:lang w:val="en-US"/>
-        </w:rPr>
-        <w:t xml:space="preserve"> </w:t>
+        <w:t xml:space="preserve">In the top left corner, you will see a list of all the available processing steps for the batch (depending on step 1). Note: the </w:t>
       </w:r>
       <w:r>
         <w:rPr>
@@ -641,23 +611,7 @@
           <w:rFonts w:ascii="Calibri" w:hAnsi="Calibri" w:cs="Calibri"/>
           <w:lang w:val="en-US"/>
         </w:rPr>
-        <w:t xml:space="preserve">', </w:t>
-      </w:r>
-      <w:proofErr w:type="gramStart"/>
-      <w:r>
-        <w:rPr>
-          <w:rFonts w:ascii="Calibri" w:hAnsi="Calibri" w:cs="Calibri"/>
-          <w:lang w:val="en-US"/>
-        </w:rPr>
-        <w:t>the</w:t>
-      </w:r>
-      <w:proofErr w:type="gramEnd"/>
-      <w:r>
-        <w:rPr>
-          <w:rFonts w:ascii="Calibri" w:hAnsi="Calibri" w:cs="Calibri"/>
-          <w:lang w:val="en-US"/>
-        </w:rPr>
-        <w:t xml:space="preserve"> batch will be interrupted after decomposition to allow the user to </w:t>
+        <w:t xml:space="preserve">', the batch will be interrupted after decomposition to allow the user to </w:t>
       </w:r>
       <w:r>
         <w:rPr>
@@ -966,23 +920,7 @@
           <w:rFonts w:ascii="Calibri" w:hAnsi="Calibri" w:cs="Calibri"/>
           <w:lang w:val="en-US"/>
         </w:rPr>
-        <w:t xml:space="preserve">, the batch will be interrupted to allow the user to manually inspect the signal and decide which components to remove (see the interpolation manual). When it is done, he </w:t>
-      </w:r>
-      <w:proofErr w:type="gramStart"/>
-      <w:r>
-        <w:rPr>
-          <w:rFonts w:ascii="Calibri" w:hAnsi="Calibri" w:cs="Calibri"/>
-          <w:lang w:val="en-US"/>
-        </w:rPr>
-        <w:t>has to</w:t>
-      </w:r>
-      <w:proofErr w:type="gramEnd"/>
-      <w:r>
-        <w:rPr>
-          <w:rFonts w:ascii="Calibri" w:hAnsi="Calibri" w:cs="Calibri"/>
-          <w:lang w:val="en-US"/>
-        </w:rPr>
-        <w:t xml:space="preserve"> click first on the </w:t>
+        <w:t xml:space="preserve">, the batch will be interrupted to allow the user to manually inspect the signal and decide which components to remove (see the interpolation manual). When it is done, he has to click first on the </w:t>
       </w:r>
       <w:r>
         <w:rPr>
@@ -1184,23 +1122,7 @@
           <w:rFonts w:ascii="Calibri" w:hAnsi="Calibri" w:cs="Calibri"/>
           <w:lang w:val="en-US"/>
         </w:rPr>
-        <w:t xml:space="preserve">regarding the place where to save the files process by the </w:t>
-      </w:r>
-      <w:proofErr w:type="gramStart"/>
-      <w:r>
-        <w:rPr>
-          <w:rFonts w:ascii="Calibri" w:hAnsi="Calibri" w:cs="Calibri"/>
-          <w:lang w:val="en-US"/>
-        </w:rPr>
-        <w:t>Batch :</w:t>
-      </w:r>
-      <w:proofErr w:type="gramEnd"/>
-      <w:r>
-        <w:rPr>
-          <w:rFonts w:ascii="Calibri" w:hAnsi="Calibri" w:cs="Calibri"/>
-          <w:lang w:val="en-US"/>
-        </w:rPr>
-        <w:t xml:space="preserve"> </w:t>
+        <w:t xml:space="preserve">regarding the place where to save the files process by the Batch : </w:t>
       </w:r>
     </w:p>
     <w:p>
@@ -1229,32 +1151,14 @@
           <w:iCs/>
           <w:lang w:val="en-US"/>
         </w:rPr>
-        <w:t xml:space="preserve">In the following </w:t>
-      </w:r>
-      <w:proofErr w:type="gramStart"/>
-      <w:r>
-        <w:rPr>
-          <w:rFonts w:ascii="Calibri" w:hAnsi="Calibri" w:cs="Calibri"/>
-          <w:i/>
-          <w:iCs/>
-          <w:lang w:val="en-US"/>
-        </w:rPr>
-        <w:t>folder’</w:t>
-      </w:r>
-      <w:r>
-        <w:rPr>
-          <w:rFonts w:ascii="Calibri" w:hAnsi="Calibri" w:cs="Calibri"/>
-          <w:lang w:val="en-US"/>
-        </w:rPr>
-        <w:t>:</w:t>
-      </w:r>
-      <w:proofErr w:type="gramEnd"/>
-      <w:r>
-        <w:rPr>
-          <w:rFonts w:ascii="Calibri" w:hAnsi="Calibri" w:cs="Calibri"/>
-          <w:lang w:val="en-US"/>
-        </w:rPr>
-        <w:t xml:space="preserve"> This option will save all processed files in the same specified folder. It will create a sub-folder for each processing step. </w:t>
+        <w:t>In the following folder’</w:t>
+      </w:r>
+      <w:r>
+        <w:rPr>
+          <w:rFonts w:ascii="Calibri" w:hAnsi="Calibri" w:cs="Calibri"/>
+          <w:lang w:val="en-US"/>
+        </w:rPr>
+        <w:t xml:space="preserve">: This option will save all processed files in the same specified folder. It will create a sub-folder for each processing step. </w:t>
       </w:r>
       <w:r>
         <w:rPr>
@@ -1459,46 +1363,14 @@
           <w:rFonts w:ascii="Calibri" w:hAnsi="Calibri" w:cs="Calibri"/>
           <w:lang w:val="en-US"/>
         </w:rPr>
-        <w:t xml:space="preserve">This is the author's choice, allowing for flexibility in processing for the user, rather than having </w:t>
-      </w:r>
-      <w:proofErr w:type="gramStart"/>
-      <w:r>
-        <w:rPr>
-          <w:rFonts w:ascii="Calibri" w:hAnsi="Calibri" w:cs="Calibri"/>
-          <w:lang w:val="en-US"/>
-        </w:rPr>
-        <w:t>full</w:t>
-      </w:r>
-      <w:proofErr w:type="gramEnd"/>
-      <w:r>
-        <w:rPr>
-          <w:rFonts w:ascii="Calibri" w:hAnsi="Calibri" w:cs="Calibri"/>
-          <w:lang w:val="en-US"/>
-        </w:rPr>
-        <w:t xml:space="preserve"> automatic processing, where you have no control.</w:t>
-      </w:r>
-      <w:r>
-        <w:rPr>
-          <w:rFonts w:ascii="Calibri" w:hAnsi="Calibri" w:cs="Calibri"/>
-          <w:lang w:val="en-US"/>
-        </w:rPr>
-        <w:t xml:space="preserve"> The only exception is </w:t>
-      </w:r>
-      <w:proofErr w:type="gramStart"/>
-      <w:r>
-        <w:rPr>
-          <w:rFonts w:ascii="Calibri" w:hAnsi="Calibri" w:cs="Calibri"/>
-          <w:lang w:val="en-US"/>
-        </w:rPr>
-        <w:t>the Bridge</w:t>
-      </w:r>
-      <w:proofErr w:type="gramEnd"/>
-      <w:r>
-        <w:rPr>
-          <w:rFonts w:ascii="Calibri" w:hAnsi="Calibri" w:cs="Calibri"/>
-          <w:lang w:val="en-US"/>
-        </w:rPr>
-        <w:t xml:space="preserve"> Detection which does not require any processing parameters. </w:t>
+        <w:t>This is the author's choice, allowing for flexibility in processing for the user, rather than having full automatic processing, where you have no control.</w:t>
+      </w:r>
+      <w:r>
+        <w:rPr>
+          <w:rFonts w:ascii="Calibri" w:hAnsi="Calibri" w:cs="Calibri"/>
+          <w:lang w:val="en-US"/>
+        </w:rPr>
+        <w:t xml:space="preserve"> The only exception is the Bridge Detection which does not require any processing parameters. </w:t>
       </w:r>
     </w:p>
     <w:p>
@@ -1607,7 +1479,6 @@
         </w:rPr>
         <w:t xml:space="preserve"> starts </w:t>
       </w:r>
-      <w:proofErr w:type="gramStart"/>
       <w:r>
         <w:rPr>
           <w:rFonts w:ascii="Calibri" w:hAnsi="Calibri" w:cs="Calibri"/>
@@ -1615,7 +1486,6 @@
         </w:rPr>
         <w:t>by</w:t>
       </w:r>
-      <w:proofErr w:type="gramEnd"/>
       <w:r>
         <w:rPr>
           <w:rFonts w:ascii="Calibri" w:hAnsi="Calibri" w:cs="Calibri"/>
@@ -1758,6 +1628,72 @@
           <w:lang w:val="en-US"/>
         </w:rPr>
         <w:br/>
+      </w:r>
+    </w:p>
+    <w:p>
+      <w:pPr>
+        <w:rPr>
+          <w:rFonts w:ascii="Calibri" w:hAnsi="Calibri" w:cs="Calibri"/>
+          <w:b/>
+          <w:bCs/>
+          <w:lang w:val="en-US"/>
+        </w:rPr>
+      </w:pPr>
+      <w:r>
+        <w:rPr>
+          <w:rFonts w:ascii="Calibri" w:hAnsi="Calibri" w:cs="Calibri"/>
+          <w:b/>
+          <w:bCs/>
+          <w:lang w:val="en-US"/>
+        </w:rPr>
+        <w:t>Why are there two references, and what do they correspond to?</w:t>
+      </w:r>
+    </w:p>
+    <w:p>
+      <w:pPr>
+        <w:rPr>
+          <w:rFonts w:ascii="Calibri" w:hAnsi="Calibri" w:cs="Calibri"/>
+          <w:lang w:val="en-US"/>
+        </w:rPr>
+      </w:pPr>
+      <w:r>
+        <w:rPr>
+          <w:rFonts w:ascii="Calibri" w:hAnsi="Calibri" w:cs="Calibri"/>
+          <w:lang w:val="en-US"/>
+        </w:rPr>
+        <w:t xml:space="preserve">In some cases, you will need to re-reference your data twice during processing. This is the case when processing </w:t>
+      </w:r>
+      <w:proofErr w:type="spellStart"/>
+      <w:r>
+        <w:rPr>
+          <w:rFonts w:ascii="Calibri" w:hAnsi="Calibri" w:cs="Calibri"/>
+          <w:lang w:val="en-US"/>
+        </w:rPr>
+        <w:t>Biosemi</w:t>
+      </w:r>
+      <w:proofErr w:type="spellEnd"/>
+      <w:r>
+        <w:rPr>
+          <w:rFonts w:ascii="Calibri" w:hAnsi="Calibri" w:cs="Calibri"/>
+          <w:lang w:val="en-US"/>
+        </w:rPr>
+        <w:t xml:space="preserve"> data, where you need to re-reference the data to </w:t>
+      </w:r>
+      <w:proofErr w:type="spellStart"/>
+      <w:r>
+        <w:rPr>
+          <w:rFonts w:ascii="Calibri" w:hAnsi="Calibri" w:cs="Calibri"/>
+          <w:lang w:val="en-US"/>
+        </w:rPr>
+        <w:t>Cz</w:t>
+      </w:r>
+      <w:proofErr w:type="spellEnd"/>
+      <w:r>
+        <w:rPr>
+          <w:rFonts w:ascii="Calibri" w:hAnsi="Calibri" w:cs="Calibri"/>
+          <w:lang w:val="en-US"/>
+        </w:rPr>
+        <w:t xml:space="preserve"> at the beginning and to the average at the end. The options 'Rereference_Reref1' and 'Rereference_Reref2' are designed for this purpose. These correspond to the ‘Reref1’ and ‘Reref2’ panels in the Re-reference module, where you can specify different parameters.</w:t>
       </w:r>
     </w:p>
     <w:sectPr>

</xml_diff>